<commit_message>
Finalise report status and deployment information
</commit_message>
<xml_diff>
--- a/report/report.docx
+++ b/report/report.docx
@@ -90,23 +90,7 @@
           <w:b/>
           <w:color w:val="0B2545"/>
         </w:rPr>
-        <w:t xml:space="preserve">Student </w:t>
-      </w:r>
-      <w:proofErr w:type="gramStart"/>
-      <w:r>
-        <w:rPr>
-          <w:b/>
-          <w:color w:val="0B2545"/>
-        </w:rPr>
-        <w:t>ID  ·</w:t>
-      </w:r>
-      <w:proofErr w:type="gramEnd"/>
-      <w:r>
-        <w:rPr>
-          <w:b/>
-          <w:color w:val="0B2545"/>
-        </w:rPr>
-        <w:t xml:space="preserve">  z5646061</w:t>
+        <w:t>Student ID  ·  z5646061</w:t>
       </w:r>
     </w:p>
     <w:p>
@@ -146,21 +130,12 @@
         <w:spacing w:before="120" w:after="200"/>
         <w:ind w:left="173" w:right="115"/>
       </w:pPr>
-      <w:proofErr w:type="spellStart"/>
       <w:r>
         <w:rPr>
           <w:b/>
           <w:color w:val="0B2545"/>
         </w:rPr>
-        <w:t>AtlasSignal</w:t>
-      </w:r>
-      <w:proofErr w:type="spellEnd"/>
-      <w:r>
-        <w:rPr>
-          <w:b/>
-          <w:color w:val="0B2545"/>
-        </w:rPr>
-        <w:t xml:space="preserve"> is a prototype investment platform that integrates systematic portfolio construction, financial news sentiment analysis and </w:t>
+        <w:t xml:space="preserve">AtlasSignal is a prototype investment platform that integrates systematic portfolio construction, financial news sentiment analysis and </w:t>
       </w:r>
       <w:r>
         <w:rPr>
@@ -170,21 +145,12 @@
         </w:rPr>
         <w:t xml:space="preserve">a </w:t>
       </w:r>
-      <w:proofErr w:type="spellStart"/>
       <w:r>
         <w:rPr>
           <w:b/>
           <w:color w:val="0B2545"/>
         </w:rPr>
-        <w:t>Streamlit</w:t>
-      </w:r>
-      <w:proofErr w:type="spellEnd"/>
-      <w:r>
-        <w:rPr>
-          <w:b/>
-          <w:color w:val="0B2545"/>
-        </w:rPr>
-        <w:t xml:space="preserve"> </w:t>
+        <w:t xml:space="preserve">Streamlit </w:t>
       </w:r>
       <w:r>
         <w:rPr>
@@ -200,7 +166,6 @@
         </w:rPr>
         <w:t xml:space="preserve"> for investors. The project compares twelve funds, rather than assuming that one </w:t>
       </w:r>
-      <w:proofErr w:type="spellStart"/>
       <w:r>
         <w:rPr>
           <w:b/>
@@ -208,7 +173,6 @@
         </w:rPr>
         <w:t>optimisation</w:t>
       </w:r>
-      <w:proofErr w:type="spellEnd"/>
       <w:r>
         <w:rPr>
           <w:b/>
@@ -386,13 +350,8 @@
         <w:t xml:space="preserve">, </w:t>
       </w:r>
       <w:r>
-        <w:t xml:space="preserve">Equal Weight has the highest </w:t>
-      </w:r>
-      <w:proofErr w:type="spellStart"/>
-      <w:r>
-        <w:t>realised</w:t>
-      </w:r>
-      <w:proofErr w:type="spellEnd"/>
+        <w:t>Equal Weight has the highest realised</w:t>
+      </w:r>
       <w:r>
         <w:t xml:space="preserve"> Sharpe ratio at 0.819. </w:t>
       </w:r>
@@ -409,29 +368,16 @@
         <w:t xml:space="preserve">ariance </w:t>
       </w:r>
       <w:r>
-        <w:t xml:space="preserve">has the highest Sharpe ratio within </w:t>
-      </w:r>
-      <w:proofErr w:type="gramStart"/>
-      <w:r>
-        <w:t>the  crypto</w:t>
-      </w:r>
-      <w:proofErr w:type="gramEnd"/>
-      <w:r>
-        <w:t xml:space="preserve"> family at</w:t>
+        <w:t>has the highest Sharpe ratio within the  crypto family at</w:t>
       </w:r>
       <w:r>
         <w:t xml:space="preserve"> 1.075, but this result is not low risk in the absolute sense: the </w:t>
       </w:r>
-      <w:proofErr w:type="spellStart"/>
       <w:r>
         <w:t>annualise</w:t>
       </w:r>
       <w:r>
-        <w:t>d</w:t>
-      </w:r>
-      <w:proofErr w:type="spellEnd"/>
-      <w:r>
-        <w:t xml:space="preserve"> volatility is 76.9%, and the maximum </w:t>
+        <w:t xml:space="preserve">d volatility is 76.9%, and the maximum </w:t>
       </w:r>
       <w:r>
         <w:t>drawdown</w:t>
@@ -440,15 +386,7 @@
         <w:t xml:space="preserve"> is -72.8%. </w:t>
       </w:r>
       <w:r>
-        <w:t xml:space="preserve">Combined Risk Parity has the highest Sharpe ratio within the combined family, at 0.888, with a 14.39% </w:t>
-      </w:r>
-      <w:proofErr w:type="spellStart"/>
-      <w:r>
-        <w:t>annualised</w:t>
-      </w:r>
-      <w:proofErr w:type="spellEnd"/>
-      <w:r>
-        <w:t xml:space="preserve"> return and 16.20% volatility. So, I think return should be considered together with</w:t>
+        <w:t>Combined Risk Parity has the highest Sharpe ratio within the combined family, at 0.888, with a 14.39% annualised return and 16.20% volatility. So, I think return should be considered together with</w:t>
       </w:r>
       <w:r>
         <w:t xml:space="preserve"> volatility and </w:t>
@@ -539,15 +477,7 @@
     </w:p>
     <w:p>
       <w:r>
-        <w:t xml:space="preserve">The </w:t>
-      </w:r>
-      <w:proofErr w:type="spellStart"/>
-      <w:r>
-        <w:t>Streamlit</w:t>
-      </w:r>
-      <w:proofErr w:type="spellEnd"/>
-      <w:r>
-        <w:t xml:space="preserve"> application transforms these results into a simple investor journey: compare fund product lines, open fund data tables, test historical fund allocations, and </w:t>
+        <w:t xml:space="preserve">The Streamlit application transforms these results into a simple investor journey: compare fund product lines, open fund data tables, test historical fund allocations, and </w:t>
       </w:r>
       <w:r>
         <w:t>explore the</w:t>
@@ -609,26 +539,10 @@
         <w:t xml:space="preserve">results from January 2021 to December 2023. The comparison of major funds assumes that the risk-free interest rate is 0% and </w:t>
       </w:r>
       <w:r>
-        <w:t xml:space="preserve">the main fund comparison assumes 0 bps transaction costs. Turnover is still reported, and the fusion experiment also includes a </w:t>
-      </w:r>
-      <w:proofErr w:type="gramStart"/>
-      <w:r>
-        <w:t>10 bps</w:t>
-      </w:r>
-      <w:proofErr w:type="gramEnd"/>
-      <w:r>
-        <w:t xml:space="preserve"> cost robustness check.</w:t>
-      </w:r>
-      <w:r>
-        <w:t xml:space="preserve"> These choices make prototypes easy to </w:t>
-      </w:r>
-      <w:proofErr w:type="gramStart"/>
-      <w:r>
-        <w:t>compare, but</w:t>
-      </w:r>
-      <w:proofErr w:type="gramEnd"/>
-      <w:r>
-        <w:t xml:space="preserve"> also limit the scope of promotion of historical results</w:t>
+        <w:t>the main fund comparison assumes 0 bps transaction costs. Turnover is still reported, and the fusion experiment also includes a 10 bps cost robustness check.</w:t>
+      </w:r>
+      <w:r>
+        <w:t xml:space="preserve"> These choices make prototypes easy to compare, but also limit the scope of promotion of historical results</w:t>
       </w:r>
       <w:r>
         <w:t>.</w:t>
@@ -660,21 +574,13 @@
         <w:t>to build a series of fund prototypes. The purpose is to compare the performance of different portfolio rules in the face of the same investment environment,</w:t>
       </w:r>
       <w:r>
-        <w:t xml:space="preserve"> rather than treating one </w:t>
-      </w:r>
-      <w:proofErr w:type="spellStart"/>
-      <w:r>
-        <w:t>optimi</w:t>
+        <w:t xml:space="preserve"> rather than treating one optimi</w:t>
       </w:r>
       <w:r>
         <w:t>s</w:t>
       </w:r>
       <w:r>
-        <w:t>er</w:t>
-      </w:r>
-      <w:proofErr w:type="spellEnd"/>
-      <w:r>
-        <w:t xml:space="preserve"> as automatically correct</w:t>
+        <w:t>er as automatically correct</w:t>
       </w:r>
       <w:r>
         <w:t xml:space="preserve">. The final product includes twelve funds: </w:t>
@@ -745,15 +651,7 @@
     </w:p>
     <w:p>
       <w:r>
-        <w:t xml:space="preserve">These four methods rely on different information. The equal weighting method is the simplest </w:t>
-      </w:r>
-      <w:proofErr w:type="gramStart"/>
-      <w:r>
-        <w:t>benchmark, and</w:t>
-      </w:r>
-      <w:proofErr w:type="gramEnd"/>
-      <w:r>
-        <w:t xml:space="preserve"> does not use the estimated mean or covariance. The minimum variance method uses the covariance matrix to seek the lowest estimated portfolio variance. The maximum Sharpe ratio method also uses the estimated mean rate of return, so its weight depends more on the estimated value of the historical rate of return. </w:t>
+        <w:t xml:space="preserve">These four methods rely on different information. The equal weighting method is the simplest benchmark, and does not use the estimated mean or covariance. The minimum variance method uses the covariance matrix to seek the lowest estimated portfolio variance. The maximum Sharpe ratio method also uses the estimated mean rate of return, so its weight depends more on the estimated value of the historical rate of return. </w:t>
       </w:r>
       <w:r>
         <w:t>Risk Parity</w:t>
@@ -762,15 +660,7 @@
         <w:t xml:space="preserve"> focuses on the contribution of each asset to portfolio risk. These differences make it possible to produce different asset allocations and different out-of-sample performance even if the underlying assets are the same</w:t>
       </w:r>
       <w:r>
-        <w:t xml:space="preserve"> (Markowitz 1952; Maillard, Roncalli &amp; </w:t>
-      </w:r>
-      <w:proofErr w:type="spellStart"/>
-      <w:r>
-        <w:t>Teiletche</w:t>
-      </w:r>
-      <w:proofErr w:type="spellEnd"/>
-      <w:r>
-        <w:t xml:space="preserve"> 2010).</w:t>
+        <w:t xml:space="preserve"> (Markowitz 1952; Maillard, Roncalli &amp; Teiletche 2010).</w:t>
       </w:r>
     </w:p>
     <w:p>
@@ -785,43 +675,7 @@
           <w:i/>
           <w:color w:val="0B2545"/>
         </w:rPr>
-        <w:t xml:space="preserve">Minimum Variance:   </w:t>
-      </w:r>
-      <w:proofErr w:type="spellStart"/>
-      <w:r>
-        <w:rPr>
-          <w:rFonts w:ascii="Cambria Math" w:hAnsi="Cambria Math"/>
-          <w:i/>
-          <w:color w:val="0B2545"/>
-        </w:rPr>
-        <w:t>min_</w:t>
-      </w:r>
-      <w:proofErr w:type="gramStart"/>
-      <w:r>
-        <w:rPr>
-          <w:rFonts w:ascii="Cambria Math" w:hAnsi="Cambria Math"/>
-          <w:i/>
-          <w:color w:val="0B2545"/>
-        </w:rPr>
-        <w:t>w</w:t>
-      </w:r>
-      <w:proofErr w:type="spellEnd"/>
-      <w:r>
-        <w:rPr>
-          <w:rFonts w:ascii="Cambria Math" w:hAnsi="Cambria Math"/>
-          <w:i/>
-          <w:color w:val="0B2545"/>
-        </w:rPr>
-        <w:t xml:space="preserve">  w</w:t>
-      </w:r>
-      <w:proofErr w:type="gramEnd"/>
-      <w:r>
-        <w:rPr>
-          <w:rFonts w:ascii="Cambria Math" w:hAnsi="Cambria Math"/>
-          <w:i/>
-          <w:color w:val="0B2545"/>
-        </w:rPr>
-        <w:t>' Sigma w</w:t>
+        <w:t>Minimum Variance:   min_w  w' Sigma w</w:t>
       </w:r>
     </w:p>
     <w:p>
@@ -859,13 +713,8 @@
         <w:t xml:space="preserve">Portfolio performance is evaluated </w:t>
       </w:r>
       <w:r>
-        <w:t xml:space="preserve">using a monthly fixed-window walk-forward OOS </w:t>
-      </w:r>
-      <w:proofErr w:type="spellStart"/>
-      <w:r>
-        <w:t>backtest</w:t>
-      </w:r>
-      <w:proofErr w:type="spellEnd"/>
+        <w:t>using a monthly fixed-window walk-forward OOS backtest</w:t>
+      </w:r>
       <w:r>
         <w:t xml:space="preserve">. On the first available date of each month, each model will generate a new target weight based on the estimation window before rebalancing. Subsequently, the portfolio holds these target weights and allows the weights to drift with the actual asset return until the next rebalancing. This schedule </w:t>
       </w:r>
@@ -920,11 +769,9 @@
       <w:r>
         <w:t xml:space="preserve">the </w:t>
       </w:r>
-      <w:proofErr w:type="spellStart"/>
       <w:r>
         <w:t>optimisation</w:t>
       </w:r>
-      <w:proofErr w:type="spellEnd"/>
       <w:r>
         <w:t xml:space="preserve"> process</w:t>
       </w:r>
@@ -1681,16 +1528,11 @@
       <w:r>
         <w:t xml:space="preserve">of-sample Sharpe ratio of 0.819, with an </w:t>
       </w:r>
-      <w:proofErr w:type="spellStart"/>
       <w:r>
         <w:t>annualise</w:t>
       </w:r>
       <w:r>
-        <w:t>d</w:t>
-      </w:r>
-      <w:proofErr w:type="spellEnd"/>
-      <w:r>
-        <w:t xml:space="preserve"> return of 13.21% and a volatility of 16.12%. This result is important because </w:t>
+        <w:t xml:space="preserve">d return of 13.21% and a volatility of 16.12%. This result is important because </w:t>
       </w:r>
       <w:r>
         <w:t xml:space="preserve">in this sample, </w:t>
@@ -1699,29 +1541,13 @@
         <w:t xml:space="preserve">the simplest strategy </w:t>
       </w:r>
       <w:r>
-        <w:t xml:space="preserve">produced a higher </w:t>
-      </w:r>
-      <w:proofErr w:type="spellStart"/>
-      <w:r>
-        <w:t>realised</w:t>
-      </w:r>
-      <w:proofErr w:type="spellEnd"/>
-      <w:r>
-        <w:t xml:space="preserve"> risk-adjusted return than the three </w:t>
-      </w:r>
-      <w:proofErr w:type="spellStart"/>
-      <w:r>
-        <w:t>optimi</w:t>
+        <w:t>produced a higher realised risk-adjusted return than the three optimi</w:t>
       </w:r>
       <w:r>
         <w:t>s</w:t>
       </w:r>
       <w:r>
-        <w:t>ation</w:t>
-      </w:r>
-      <w:proofErr w:type="spellEnd"/>
-      <w:r>
-        <w:t xml:space="preserve"> methods.</w:t>
+        <w:t>ation methods.</w:t>
       </w:r>
       <w:r>
         <w:t xml:space="preserve"> The </w:t>
@@ -1738,27 +1564,14 @@
       <w:r>
         <w:t xml:space="preserve"> of -18.49%, but its </w:t>
       </w:r>
-      <w:proofErr w:type="spellStart"/>
       <w:r>
         <w:t>annualise</w:t>
       </w:r>
       <w:r>
-        <w:t>d</w:t>
-      </w:r>
-      <w:proofErr w:type="spellEnd"/>
-      <w:r>
-        <w:t xml:space="preserve"> return was only 10.51%, resulting in the Sharpe ratio of only 0.723. A reasonable explanation is that the equal weighting strategy is less sensitive to estimated errors because it does not depend on the estimated expected rate of return. </w:t>
-      </w:r>
-      <w:r>
-        <w:t xml:space="preserve">This does not mean that </w:t>
-      </w:r>
-      <w:proofErr w:type="spellStart"/>
-      <w:r>
-        <w:t>optimisation</w:t>
-      </w:r>
-      <w:proofErr w:type="spellEnd"/>
-      <w:r>
-        <w:t xml:space="preserve"> is useless. Instead, it shows that a more complex model does not necessarily lead to better OOS performance</w:t>
+        <w:t xml:space="preserve">d return was only 10.51%, resulting in the Sharpe ratio of only 0.723. A reasonable explanation is that the equal weighting strategy is less sensitive to estimated errors because it does not depend on the estimated expected rate of return. </w:t>
+      </w:r>
+      <w:r>
+        <w:t>This does not mean that optimisation is useless. Instead, it shows that a more complex model does not necessarily lead to better OOS performance</w:t>
       </w:r>
       <w:r>
         <w:t>.</w:t>
@@ -1789,16 +1602,11 @@
       <w:r>
         <w:t xml:space="preserve">. The </w:t>
       </w:r>
-      <w:proofErr w:type="spellStart"/>
       <w:r>
         <w:t>annualise</w:t>
       </w:r>
       <w:r>
-        <w:t>d</w:t>
-      </w:r>
-      <w:proofErr w:type="spellEnd"/>
-      <w:r>
-        <w:t xml:space="preserve"> arithmetic rate of return of Crypto Minimum Variance is 82.66%, the volatility rate is 76.91%, the </w:t>
+        <w:t xml:space="preserve">d arithmetic rate of return of Crypto Minimum Variance is 82.66%, the volatility rate is 76.91%, the </w:t>
       </w:r>
       <w:r>
         <w:t>Sharpe ratio</w:t>
@@ -2554,11 +2362,9 @@
       <w:r>
         <w:t xml:space="preserve"> the highest </w:t>
       </w:r>
-      <w:proofErr w:type="spellStart"/>
       <w:r>
         <w:t>realised</w:t>
       </w:r>
-      <w:proofErr w:type="spellEnd"/>
       <w:r>
         <w:t xml:space="preserve"> Sharpe ratio, </w:t>
       </w:r>
@@ -2568,27 +2374,17 @@
       <w:r>
         <w:t xml:space="preserve"> 0.888. Its </w:t>
       </w:r>
-      <w:proofErr w:type="spellStart"/>
       <w:r>
         <w:t>annualise</w:t>
       </w:r>
       <w:r>
-        <w:t>d</w:t>
-      </w:r>
-      <w:proofErr w:type="spellEnd"/>
-      <w:r>
-        <w:t xml:space="preserve"> rate of return is 14.39%, slightly lower than the 16.43% of the equal weight strategy, but the volatility is lower. The </w:t>
-      </w:r>
-      <w:proofErr w:type="spellStart"/>
+        <w:t xml:space="preserve">d rate of return is 14.39%, slightly lower than the 16.43% of the equal weight strategy, but the volatility is lower. The </w:t>
+      </w:r>
       <w:r>
         <w:t>annualise</w:t>
       </w:r>
       <w:r>
-        <w:t>d</w:t>
-      </w:r>
-      <w:proofErr w:type="spellEnd"/>
-      <w:r>
-        <w:t xml:space="preserve"> volatility is only 16.20%, while the equal weight strategy is 21.60%; the maximum </w:t>
+        <w:t xml:space="preserve">d volatility is only 16.20%, while the equal weight strategy is 21.60%; the maximum </w:t>
       </w:r>
       <w:r>
         <w:t>drawdown</w:t>
@@ -2623,24 +2419,14 @@
       <w:r>
         <w:t xml:space="preserve">, which is -15.78%, but the </w:t>
       </w:r>
-      <w:proofErr w:type="spellStart"/>
       <w:r>
         <w:t>annualise</w:t>
       </w:r>
       <w:r>
-        <w:t>d</w:t>
-      </w:r>
-      <w:proofErr w:type="spellEnd"/>
-      <w:r>
-        <w:t xml:space="preserve"> rate of return drops to 6.48%. </w:t>
-      </w:r>
-      <w:proofErr w:type="gramStart"/>
-      <w:r>
-        <w:t>So</w:t>
-      </w:r>
-      <w:proofErr w:type="gramEnd"/>
-      <w:r>
-        <w:t xml:space="preserve"> there is no simple “best” fund based on one number. The choice depends on how much return, volatility and drawdown the investor is willing to accept</w:t>
+        <w:t xml:space="preserve">d rate of return drops to 6.48%. </w:t>
+      </w:r>
+      <w:r>
+        <w:t>So there is no simple “best” fund based on one number. The choice depends on how much return, volatility and drawdown the investor is willing to accept</w:t>
       </w:r>
       <w:r>
         <w:t>.</w:t>
@@ -2835,16 +2621,11 @@
       <w:r>
         <w:t xml:space="preserve">, and the </w:t>
       </w:r>
-      <w:proofErr w:type="spellStart"/>
       <w:r>
         <w:t>annualise</w:t>
       </w:r>
       <w:r>
-        <w:t>d</w:t>
-      </w:r>
-      <w:proofErr w:type="spellEnd"/>
-      <w:r>
-        <w:t xml:space="preserve"> </w:t>
+        <w:t xml:space="preserve">d </w:t>
       </w:r>
       <w:r>
         <w:t>turnover</w:t>
@@ -2924,15 +2705,7 @@
         <w:t>portfolio</w:t>
       </w:r>
       <w:r>
-        <w:t xml:space="preserve"> under the set </w:t>
-      </w:r>
-      <w:proofErr w:type="gramStart"/>
-      <w:r>
-        <w:t>constraints, and</w:t>
-      </w:r>
-      <w:proofErr w:type="gramEnd"/>
-      <w:r>
-        <w:t xml:space="preserve"> also explains why a single risk indicator should not be used to describe a low-volatility portfolio. Therefore, the application shows the latest OOS </w:t>
+        <w:t xml:space="preserve"> under the set constraints, and also explains why a single risk indicator should not be used to describe a low-volatility portfolio. Therefore, the application shows the latest OOS </w:t>
       </w:r>
       <w:r>
         <w:t>target weight</w:t>
@@ -2967,16 +2740,11 @@
         <w:t xml:space="preserve"> method</w:t>
       </w:r>
       <w:r>
-        <w:t xml:space="preserve"> in the sample. It has not reached the highest </w:t>
-      </w:r>
-      <w:proofErr w:type="spellStart"/>
-      <w:r>
-        <w:t>real</w:t>
+        <w:t xml:space="preserve"> in the sample. It has not reached the highest real</w:t>
       </w:r>
       <w:r>
         <w:t>ised</w:t>
       </w:r>
-      <w:proofErr w:type="spellEnd"/>
       <w:r>
         <w:t xml:space="preserve"> Sharpe ratio in any family</w:t>
       </w:r>
@@ -2986,7 +2754,6 @@
       <w:r>
         <w:t xml:space="preserve"> </w:t>
       </w:r>
-      <w:proofErr w:type="spellStart"/>
       <w:r>
         <w:t>A</w:t>
       </w:r>
@@ -2994,11 +2761,7 @@
         <w:t>nnualise</w:t>
       </w:r>
       <w:r>
-        <w:t>d</w:t>
-      </w:r>
-      <w:proofErr w:type="spellEnd"/>
-      <w:r>
-        <w:t xml:space="preserve"> turnover </w:t>
+        <w:t xml:space="preserve">d turnover </w:t>
       </w:r>
       <w:r>
         <w:t>for</w:t>
@@ -3036,11 +2799,9 @@
       <w:r>
         <w:t xml:space="preserve"> </w:t>
       </w:r>
-      <w:proofErr w:type="spellStart"/>
       <w:r>
         <w:t>optimisation</w:t>
       </w:r>
-      <w:proofErr w:type="spellEnd"/>
       <w:r>
         <w:t xml:space="preserve"> </w:t>
       </w:r>
@@ -3086,11 +2847,7 @@
         <w:t xml:space="preserve"> of the</w:t>
       </w:r>
       <w:r>
-        <w:t xml:space="preserve"> twelve fact sheets </w:t>
-      </w:r>
-      <w:proofErr w:type="spellStart"/>
-      <w:r>
-        <w:t>summari</w:t>
+        <w:t xml:space="preserve"> twelve fact sheets summari</w:t>
       </w:r>
       <w:r>
         <w:t>s</w:t>
@@ -3101,7 +2858,6 @@
       <w:r>
         <w:t>s</w:t>
       </w:r>
-      <w:proofErr w:type="spellEnd"/>
       <w:r>
         <w:t xml:space="preserve"> the required indicators: growth</w:t>
       </w:r>
@@ -3111,16 +2867,11 @@
       <w:r>
         <w:t xml:space="preserve">, </w:t>
       </w:r>
-      <w:proofErr w:type="spellStart"/>
       <w:r>
         <w:t>annualise</w:t>
       </w:r>
       <w:r>
-        <w:t>d</w:t>
-      </w:r>
-      <w:proofErr w:type="spellEnd"/>
-      <w:r>
-        <w:t xml:space="preserve"> rate of return, volatility, Sharpe ratio, maximum </w:t>
+        <w:t xml:space="preserve">d rate of return, volatility, Sharpe ratio, maximum </w:t>
       </w:r>
       <w:r>
         <w:t>drawdown</w:t>
@@ -3132,15 +2883,7 @@
         <w:t>Value at Risk</w:t>
       </w:r>
       <w:r>
-        <w:t xml:space="preserve"> (</w:t>
-      </w:r>
-      <w:proofErr w:type="spellStart"/>
-      <w:r>
-        <w:t>VaR</w:t>
-      </w:r>
-      <w:proofErr w:type="spellEnd"/>
-      <w:r>
-        <w:t xml:space="preserve">), </w:t>
+        <w:t xml:space="preserve"> (VaR), </w:t>
       </w:r>
       <w:r>
         <w:t>Expected Shortfall</w:t>
@@ -3155,15 +2898,7 @@
         <w:t>portfolio turnover</w:t>
       </w:r>
       <w:r>
-        <w:t xml:space="preserve">. The latest target comes from OOS rebalancing on December 1, 2023, which is a </w:t>
-      </w:r>
-      <w:proofErr w:type="spellStart"/>
-      <w:r>
-        <w:t>backtest</w:t>
-      </w:r>
-      <w:proofErr w:type="spellEnd"/>
-      <w:r>
-        <w:t xml:space="preserve"> model target, not a real-time recommendation</w:t>
+        <w:t>. The latest target comes from OOS rebalancing on December 1, 2023, which is a backtest model target, not a real-time recommendation</w:t>
       </w:r>
       <w:r>
         <w:t>.</w:t>
@@ -3211,15 +2946,7 @@
         <w:t>use lexical polarity together with casing, punctuation, intensifiers and negation</w:t>
       </w:r>
       <w:r>
-        <w:t xml:space="preserve"> (Hutto &amp; Gilbert 2014). Therefore, the original title text was retained instead of being forcibly cleaned up. This makes the model easy to </w:t>
-      </w:r>
-      <w:proofErr w:type="gramStart"/>
-      <w:r>
-        <w:t>audit, but</w:t>
-      </w:r>
-      <w:proofErr w:type="gramEnd"/>
-      <w:r>
-        <w:t xml:space="preserve"> also leaves an important limitation: the </w:t>
+        <w:t xml:space="preserve"> (Hutto &amp; Gilbert 2014). Therefore, the original title text was retained instead of being forcibly cleaned up. This makes the model easy to audit, but also leaves an important limitation: the </w:t>
       </w:r>
       <w:r>
         <w:t>general-language lexicon</w:t>
@@ -3306,80 +3033,19 @@
           <w:i/>
           <w:color w:val="0B2545"/>
         </w:rPr>
-        <w:t xml:space="preserve">Sector </w:t>
-      </w:r>
-      <w:proofErr w:type="spellStart"/>
-      <w:r>
-        <w:rPr>
-          <w:rFonts w:ascii="Cambria Math" w:hAnsi="Cambria Math"/>
-          <w:i/>
-          <w:color w:val="0B2545"/>
-        </w:rPr>
-        <w:t>sentiment_</w:t>
-      </w:r>
-      <w:proofErr w:type="gramStart"/>
-      <w:r>
-        <w:rPr>
-          <w:rFonts w:ascii="Cambria Math" w:hAnsi="Cambria Math"/>
-          <w:i/>
-          <w:color w:val="0B2545"/>
-        </w:rPr>
-        <w:t>s,t</w:t>
-      </w:r>
-      <w:proofErr w:type="spellEnd"/>
-      <w:proofErr w:type="gramEnd"/>
-      <w:r>
-        <w:rPr>
-          <w:rFonts w:ascii="Cambria Math" w:hAnsi="Cambria Math"/>
-          <w:i/>
-          <w:color w:val="0B2545"/>
-        </w:rPr>
-        <w:t xml:space="preserve"> = (1 / N_</w:t>
-      </w:r>
-      <w:proofErr w:type="gramStart"/>
-      <w:r>
-        <w:rPr>
-          <w:rFonts w:ascii="Cambria Math" w:hAnsi="Cambria Math"/>
-          <w:i/>
-          <w:color w:val="0B2545"/>
-        </w:rPr>
-        <w:t>s,t</w:t>
-      </w:r>
-      <w:proofErr w:type="gramEnd"/>
-      <w:r>
-        <w:rPr>
-          <w:rFonts w:ascii="Cambria Math" w:hAnsi="Cambria Math"/>
-          <w:i/>
-          <w:color w:val="0B2545"/>
-        </w:rPr>
-        <w:t>) sum_i Sentiment_</w:t>
-      </w:r>
-      <w:proofErr w:type="gramStart"/>
-      <w:r>
-        <w:rPr>
-          <w:rFonts w:ascii="Cambria Math" w:hAnsi="Cambria Math"/>
-          <w:i/>
-          <w:color w:val="0B2545"/>
-        </w:rPr>
-        <w:t>i,t</w:t>
-      </w:r>
-      <w:proofErr w:type="gramEnd"/>
+        <w:t>Sector sentiment_s,t = (1 / N_s,t) sum_i Sentiment_i,t</w:t>
+      </w:r>
     </w:p>
     <w:p>
       <w:r>
         <w:t>Exhibit</w:t>
       </w:r>
       <w:r>
-        <w:t xml:space="preserve"> A6 draws the </w:t>
-      </w:r>
-      <w:proofErr w:type="gramStart"/>
-      <w:r>
-        <w:t xml:space="preserve">ten </w:t>
+        <w:t xml:space="preserve"> A6 draws the ten </w:t>
       </w:r>
       <w:r>
         <w:t>sector</w:t>
       </w:r>
-      <w:proofErr w:type="gramEnd"/>
       <w:r>
         <w:t xml:space="preserve"> </w:t>
       </w:r>
@@ -3407,13 +3073,8 @@
       <w:r>
         <w:t xml:space="preserve"> </w:t>
       </w:r>
-      <w:proofErr w:type="gramStart"/>
-      <w:r>
-        <w:t>has</w:t>
-      </w:r>
-      <w:proofErr w:type="gramEnd"/>
-      <w:r>
-        <w:t xml:space="preserve"> an average raw sentiment of about 0.096, while</w:t>
+      <w:r>
+        <w:t>has an average raw sentiment of about 0.096, while</w:t>
       </w:r>
       <w:r>
         <w:t xml:space="preserve"> </w:t>
@@ -3437,15 +3098,7 @@
         <w:t xml:space="preserve"> 0.184, but these levels cannot be directly compared without considering the coverage rate. </w:t>
       </w:r>
       <w:r>
-        <w:t xml:space="preserve">Utilities </w:t>
-      </w:r>
-      <w:proofErr w:type="gramStart"/>
-      <w:r>
-        <w:t>has</w:t>
-      </w:r>
-      <w:proofErr w:type="gramEnd"/>
-      <w:r>
-        <w:t xml:space="preserve"> average ticker coverage of 59.3%</w:t>
+        <w:t>Utilities has average ticker coverage of 59.3%</w:t>
       </w:r>
       <w:r>
         <w:t xml:space="preserve">, and there are 44 trading days without news, while </w:t>
@@ -3562,15 +3215,7 @@
         <w:t xml:space="preserve"> </w:t>
       </w:r>
       <w:r>
-        <w:t xml:space="preserve">sentiment score is less representative. Therefore, </w:t>
-      </w:r>
-      <w:proofErr w:type="spellStart"/>
-      <w:r>
-        <w:t>AtlasSignal</w:t>
-      </w:r>
-      <w:proofErr w:type="spellEnd"/>
-      <w:r>
-        <w:t xml:space="preserve"> adjusts the </w:t>
+        <w:t xml:space="preserve">sentiment score is less representative. Therefore, AtlasSignal adjusts the </w:t>
       </w:r>
       <w:r>
         <w:t xml:space="preserve">lagged </w:t>
@@ -3596,11 +3241,9 @@
       <w:r>
         <w:t xml:space="preserve">, which combines the </w:t>
       </w:r>
-      <w:proofErr w:type="spellStart"/>
       <w:r>
         <w:t>normalised</w:t>
       </w:r>
-      <w:proofErr w:type="spellEnd"/>
       <w:r>
         <w:t xml:space="preserve"> </w:t>
       </w:r>
@@ -3632,100 +3275,18 @@
         <w:spacing w:before="80" w:after="160"/>
         <w:jc w:val="center"/>
       </w:pPr>
-      <w:proofErr w:type="spellStart"/>
       <w:r>
         <w:rPr>
           <w:rFonts w:ascii="Cambria Math" w:hAnsi="Cambria Math"/>
           <w:i/>
           <w:color w:val="0B2545"/>
         </w:rPr>
-        <w:t>Confidence_</w:t>
-      </w:r>
-      <w:proofErr w:type="gramStart"/>
-      <w:r>
-        <w:rPr>
-          <w:rFonts w:ascii="Cambria Math" w:hAnsi="Cambria Math"/>
-          <w:i/>
-          <w:color w:val="0B2545"/>
-        </w:rPr>
-        <w:t>s,t</w:t>
-      </w:r>
-      <w:proofErr w:type="spellEnd"/>
-      <w:proofErr w:type="gramEnd"/>
-      <w:r>
-        <w:rPr>
-          <w:rFonts w:ascii="Cambria Math" w:hAnsi="Cambria Math"/>
-          <w:i/>
-          <w:color w:val="0B2545"/>
-        </w:rPr>
-        <w:t xml:space="preserve"> = (1 - mean HHI_</w:t>
-      </w:r>
-      <w:proofErr w:type="gramStart"/>
-      <w:r>
-        <w:rPr>
-          <w:rFonts w:ascii="Cambria Math" w:hAnsi="Cambria Math"/>
-          <w:i/>
-          <w:color w:val="0B2545"/>
-        </w:rPr>
-        <w:t>s,t</w:t>
-      </w:r>
-      <w:proofErr w:type="gramEnd"/>
-      <w:r>
-        <w:rPr>
-          <w:rFonts w:ascii="Cambria Math" w:hAnsi="Cambria Math"/>
-          <w:i/>
-          <w:color w:val="0B2545"/>
-        </w:rPr>
-        <w:t xml:space="preserve"> over 3 completed months) × </w:t>
-      </w:r>
-      <w:proofErr w:type="gramStart"/>
-      <w:r>
-        <w:rPr>
-          <w:rFonts w:ascii="Cambria Math" w:hAnsi="Cambria Math"/>
-          <w:i/>
-          <w:color w:val="0B2545"/>
-        </w:rPr>
-        <w:t>sqrt(</w:t>
-      </w:r>
-      <w:proofErr w:type="gramEnd"/>
-      <w:r>
-        <w:rPr>
-          <w:rFonts w:ascii="Cambria Math" w:hAnsi="Cambria Math"/>
-          <w:i/>
-          <w:color w:val="0B2545"/>
-        </w:rPr>
-        <w:t>Coverage_</w:t>
-      </w:r>
-      <w:proofErr w:type="gramStart"/>
-      <w:r>
-        <w:rPr>
-          <w:rFonts w:ascii="Cambria Math" w:hAnsi="Cambria Math"/>
-          <w:i/>
-          <w:color w:val="0B2545"/>
-        </w:rPr>
-        <w:t>s,t</w:t>
-      </w:r>
-      <w:proofErr w:type="gramEnd"/>
-      <w:r>
-        <w:rPr>
-          <w:rFonts w:ascii="Cambria Math" w:hAnsi="Cambria Math"/>
-          <w:i/>
-          <w:color w:val="0B2545"/>
-        </w:rPr>
-        <w:t xml:space="preserve"> over prior 21 trading days)</w:t>
+        <w:t>Confidence_s,t = (1 - mean HHI_s,t over 3 completed months) × sqrt(Coverage_s,t over prior 21 trading days)</w:t>
       </w:r>
     </w:p>
     <w:p>
       <w:r>
-        <w:t xml:space="preserve">At each monthly rebalance, the lagged 21-trading-day sector sentiment mean is </w:t>
-      </w:r>
-      <w:proofErr w:type="spellStart"/>
-      <w:r>
-        <w:t>standardised</w:t>
-      </w:r>
-      <w:proofErr w:type="spellEnd"/>
-      <w:r>
-        <w:t xml:space="preserve"> across sectors, clipped, and scaled to a maximum 25% relative tilt</w:t>
+        <w:t>At each monthly rebalance, the lagged 21-trading-day sector sentiment mean is standardised across sectors, clipped, and scaled to a maximum 25% relative tilt</w:t>
       </w:r>
       <w:r>
         <w:t>. This t</w:t>
@@ -4922,15 +4483,7 @@
         <w:t xml:space="preserve">. </w:t>
       </w:r>
       <w:r>
-        <w:t xml:space="preserve">Turnover also increases after adding sentiment. For equity, </w:t>
-      </w:r>
-      <w:proofErr w:type="spellStart"/>
-      <w:r>
-        <w:t>annualised</w:t>
-      </w:r>
-      <w:proofErr w:type="spellEnd"/>
-      <w:r>
-        <w:t xml:space="preserve"> turnover is 58.8% under the naive tilt and 53.1% after coverage adjustment. For the combined fund, the figures are 63.7% and 58.3% respectively</w:t>
+        <w:t>Turnover also increases after adding sentiment. For equity, annualised turnover is 58.8% under the naive tilt and 53.1% after coverage adjustment. For the combined fund, the figures are 63.7% and 58.3% respectively</w:t>
       </w:r>
       <w:r>
         <w:t>.</w:t>
@@ -5067,13 +4620,8 @@
       </w:r>
     </w:p>
     <w:p>
-      <w:proofErr w:type="spellStart"/>
-      <w:r>
-        <w:t>AtlasSignal</w:t>
-      </w:r>
-      <w:proofErr w:type="spellEnd"/>
-      <w:r>
-        <w:t xml:space="preserve"> is aimed at users with financial knowledge who can understand </w:t>
+      <w:r>
+        <w:t xml:space="preserve">AtlasSignal is aimed at users with financial knowledge who can understand </w:t>
       </w:r>
       <w:r>
         <w:t>return</w:t>
@@ -5241,11 +4789,9 @@
       <w:r>
         <w:t xml:space="preserve"> </w:t>
       </w:r>
-      <w:proofErr w:type="spellStart"/>
       <w:r>
         <w:t>normalised</w:t>
       </w:r>
-      <w:proofErr w:type="spellEnd"/>
       <w:r>
         <w:t xml:space="preserve"> to 100%, and each combination is allowed to drift after initial allocation. When </w:t>
       </w:r>
@@ -5314,15 +4860,7 @@
         <w:t>artifacts</w:t>
       </w:r>
       <w:r>
-        <w:t xml:space="preserve"> from the results/ directory instead of running VADER on the server or rebuilding the portfolio </w:t>
-      </w:r>
-      <w:proofErr w:type="spellStart"/>
-      <w:r>
-        <w:t>backtest</w:t>
-      </w:r>
-      <w:proofErr w:type="spellEnd"/>
-      <w:r>
-        <w:t>. This maintains the responsiveness of the interface and separates model production from display. In addition to using colors, the visual design also adopts method shapes and line styles, and no horizontal page overflow problems were found in desktop and 390-pixel-wide browser tests</w:t>
+        <w:t xml:space="preserve"> from the results/ directory instead of running VADER on the server or rebuilding the portfolio backtest. This maintains the responsiveness of the interface and separates model production from display. In addition to using colors, the visual design also adopts method shapes and line styles, and no horizontal page overflow problems were found in desktop and 390-pixel-wide browser tests</w:t>
       </w:r>
       <w:r>
         <w:t>.</w:t>
@@ -5353,11 +4891,9 @@
       <w:r>
         <w:t xml:space="preserve"> </w:t>
       </w:r>
-      <w:proofErr w:type="spellStart"/>
       <w:r>
         <w:t>normalised</w:t>
       </w:r>
-      <w:proofErr w:type="spellEnd"/>
       <w:r>
         <w:t xml:space="preserve"> transparent</w:t>
       </w:r>
@@ -5422,15 +4958,7 @@
         <w:t>Combined Risk Parity produced the strongest combined-family Sharpe in this sample</w:t>
       </w:r>
       <w:r>
-        <w:t xml:space="preserve">, and the application </w:t>
-      </w:r>
-      <w:proofErr w:type="gramStart"/>
-      <w:r>
-        <w:t>associates</w:t>
-      </w:r>
-      <w:proofErr w:type="gramEnd"/>
-      <w:r>
-        <w:t xml:space="preserve"> summary statistics with growth, </w:t>
+        <w:t xml:space="preserve">, and the application associates summary statistics with growth, </w:t>
       </w:r>
       <w:r>
         <w:t>drawdown</w:t>
@@ -5589,16 +5117,11 @@
       <w:r>
         <w:t xml:space="preserve">, the arithmetic </w:t>
       </w:r>
-      <w:proofErr w:type="spellStart"/>
       <w:r>
         <w:t>annualise</w:t>
       </w:r>
       <w:r>
-        <w:t>d</w:t>
-      </w:r>
-      <w:proofErr w:type="spellEnd"/>
-      <w:r>
-        <w:t xml:space="preserve"> return may be significantly different from compound investor</w:t>
+        <w:t>d return may be significantly different from compound investor</w:t>
       </w:r>
       <w:r>
         <w:t xml:space="preserve"> growth</w:t>
@@ -5622,15 +5145,7 @@
         <w:t>Value at Risk</w:t>
       </w:r>
       <w:r>
-        <w:t xml:space="preserve"> (</w:t>
-      </w:r>
-      <w:proofErr w:type="spellStart"/>
-      <w:r>
-        <w:t>VaR</w:t>
-      </w:r>
-      <w:proofErr w:type="spellEnd"/>
-      <w:r>
-        <w:t xml:space="preserve">) and </w:t>
+        <w:t xml:space="preserve"> (VaR) and </w:t>
       </w:r>
       <w:r>
         <w:t>Expected Shortfall</w:t>
@@ -8368,46 +7883,12 @@
       <w:pStyle w:val="Footer"/>
       <w:jc w:val="center"/>
     </w:pPr>
-    <w:proofErr w:type="spellStart"/>
-    <w:proofErr w:type="gramStart"/>
     <w:r>
       <w:rPr>
         <w:color w:val="5E6978"/>
         <w:sz w:val="18"/>
       </w:rPr>
-      <w:t>AtlasSignal</w:t>
-    </w:r>
-    <w:proofErr w:type="spellEnd"/>
-    <w:r>
-      <w:rPr>
-        <w:color w:val="5E6978"/>
-        <w:sz w:val="18"/>
-      </w:rPr>
-      <w:t xml:space="preserve">  |</w:t>
-    </w:r>
-    <w:proofErr w:type="gramEnd"/>
-    <w:r>
-      <w:rPr>
-        <w:color w:val="5E6978"/>
-        <w:sz w:val="18"/>
-      </w:rPr>
-      <w:t xml:space="preserve">  z</w:t>
-    </w:r>
-    <w:proofErr w:type="gramStart"/>
-    <w:r>
-      <w:rPr>
-        <w:color w:val="5E6978"/>
-        <w:sz w:val="18"/>
-      </w:rPr>
-      <w:t>5646061  |</w:t>
-    </w:r>
-    <w:proofErr w:type="gramEnd"/>
-    <w:r>
-      <w:rPr>
-        <w:color w:val="5E6978"/>
-        <w:sz w:val="18"/>
-      </w:rPr>
-      <w:t xml:space="preserve">  </w:t>
+      <w:t xml:space="preserve">AtlasSignal  |  z5646061  |  </w:t>
     </w:r>
     <w:r>
       <w:rPr>

</xml_diff>